<commit_message>
廚師: 儲糧有道 now weighs water/food 0.5 each (rounded up in total)
Water, food and 水糧包 are tallied together and cost ceil(n/2) slots,
same shape as 礦工's gold. Skill lists and the replacement report updated.

Co-Authored-By: Claude Sonnet 5.5 <noreply@anthropic.com>
</commit_message>
<xml_diff>
--- a/禁閉逃殺_移除富豪替補職業建議報告.docx
+++ b/禁閉逃殺_移除富豪替補職業建議報告.docx
@@ -36,7 +36,7 @@
         <w:pStyle w:val="ListBullet"/>
       </w:pPr>
       <w:r>
-        <w:t>第二推薦：廚師（約 7.1 分）——直接解決全場最大壓力「飢餓」，完全不需要追蹤；稍強，建議實測。</w:t>
+        <w:t>第二推薦：廚師（約 6.9 分，水糧負重各 0.5）——直接解決全場最大壓力「飢餓」，完全不需要追蹤；強度與走私客相近。</w:t>
       </w:r>
     </w:p>
     <w:p>
@@ -261,7 +261,7 @@
               <w:rPr>
                 <w:sz w:val="19"/>
               </w:rPr>
-              <w:t>每輪繳1份水或糧即同時免水糧飢餓；水糧不佔負重</w:t>
+              <w:t>每輪繳1份水或糧即同時免水糧飢餓；水糧各0.5負重（合計四捨五入）</w:t>
             </w:r>
           </w:p>
         </w:tc>
@@ -287,7 +287,7 @@
               <w:rPr>
                 <w:sz w:val="19"/>
               </w:rPr>
-              <w:t>解決飢餓，零追蹤；稍強</w:t>
+              <w:t>解決飢餓，零追蹤</w:t>
             </w:r>
           </w:p>
         </w:tc>
@@ -2318,7 +2318,7 @@
     </w:p>
     <w:p>
       <w:r>
-        <w:t>定位：補給・飢餓　｜　預估強度：7.1（B 級上段）　｜　新手友善 ★★★★★　主持難度 ★☆☆☆☆</w:t>
+        <w:t>定位：補給・飢餓　｜　預估強度：6.9（B 級）　｜　新手友善 ★★★★★　主持難度 ★☆☆☆☆</w:t>
       </w:r>
     </w:p>
     <w:tbl>
@@ -2456,7 +2456,7 @@
               <w:rPr>
                 <w:sz w:val="19"/>
               </w:rPr>
-              <w:t>水與糧食永久不佔負重。</w:t>
+              <w:t>水與糧食的負重各為0.5（水、糧合計，總負重四捨五入：2份算1格、3份算2格）。</w:t>
             </w:r>
           </w:p>
         </w:tc>
@@ -2484,7 +2484,7 @@
         <w:pStyle w:val="ListBullet"/>
       </w:pPr>
       <w:r>
-        <w:t>水糧不佔負重，背包格全部留給武器、藥片等道具。</w:t>
+        <w:t>水糧各0.5負重（合計進位：2份算1格），同樣背包格可以多放一倍的水糧，其餘留給武器、藥片等道具。</w:t>
       </w:r>
     </w:p>
     <w:p>
@@ -2548,7 +2548,7 @@
         <w:pStyle w:val="ListBullet"/>
       </w:pPr>
       <w:r>
-        <w:t>配點建議：武力2／速度5／負重3（水糧不佔負重，負重可少放，把點數放在速度）。</w:t>
+        <w:t>配點建議：武力2／速度5／負重3（水糧負重減半，負重可少放，把點數放在速度）。</w:t>
       </w:r>
     </w:p>
     <w:p>
@@ -2583,7 +2583,7 @@
         <w:t>平衡與主持建議：</w:t>
       </w:r>
       <w:r>
-        <w:t>稍強，建議先實測。若偏強，可改為「水不佔負重」不再適用，或糧食需求改為每2輪才一次。</w:t>
+        <w:t>強度與走私客相近，建議先實測。若偏強，可把水糧負重改回1（只保留一餐抵兩餐，約6.6），若偏弱可改為水糧不佔負重（約7.1）。</w:t>
       </w:r>
     </w:p>
     <w:p>
@@ -3650,7 +3650,7 @@
               <w:rPr>
                 <w:sz w:val="19"/>
               </w:rPr>
-              <w:t>7.1</w:t>
+              <w:t>6.9</w:t>
             </w:r>
           </w:p>
         </w:tc>
@@ -3702,7 +3702,7 @@
               <w:rPr>
                 <w:sz w:val="19"/>
               </w:rPr>
-              <w:t>稍強</w:t>
+              <w:t>無</w:t>
             </w:r>
           </w:p>
         </w:tc>
@@ -4014,7 +4014,7 @@
         <w:pStyle w:val="ListBullet"/>
       </w:pPr>
       <w:r>
-        <w:t>目前16位平均約 6.43；移除富豪（6.6）後剩15位平均約 6.42。替換成走私客（6.9）約 6.45；替換成廚師（7.1）約 6.46；差異很小，陣容整體仍均衡。</w:t>
+        <w:t>目前16位平均約 6.43；移除富豪（6.6）後剩15位平均約 6.42。替換成走私客（6.9）約 6.45；替換成廚師（6.9）約 6.45；差異很小，陣容整體仍均衡。</w:t>
       </w:r>
     </w:p>
     <w:p>

</xml_diff>

<commit_message>
Swap in 超度師/防爆小組 for 富豪/暗影使者; rebalance and re-evaluate roster
- 實體模式: replace 富豪 with 超度師 and 暗影使者 with 防爆小組
- 超度師: 臨終祝禱 usable twice
- 防爆小組: 防爆盾牌 -4 (gun damage) but cannot hold guns (a drawn gun is
  put back and one more is drawn); 爆破緩衝 now ignores 火箭筒 damage
- Add tools/sim_physical.js + analysis scripts and the 550-game, 9-player
  results; update the 16-profession report with simulation-based scores

Co-Authored-By: Claude Sonnet 5.5 <noreply@anthropic.com>
</commit_message>
<xml_diff>
--- a/禁閉逃殺_移除富豪替補職業建議報告.docx
+++ b/禁閉逃殺_移除富豪替補職業建議報告.docx
@@ -13,6 +13,11 @@
     <w:p>
       <w:r>
         <w:t>評估日期：2026/10/6　｜　依據：index.html 現行 APP 規則與職業資料　｜　條件：好理解、主持人好帶、不破壞現有平衡（分數為作者主觀估計，非實測）</w:t>
+      </w:r>
+    </w:p>
+    <w:p>
+      <w:r>
+        <w:t>【最終決定】本報告完成後，實際採用「超度師」取代富豪（超度師本傳職業，技能經修改：臨終祝禱可發動兩次、安魂儀式1次）。以下為當時比較五位候選的分析，保留作為備選參考；超度師的詳細評估見《實體模式16職業評估報告（詳細版）》。</w:t>
       </w:r>
     </w:p>
     <w:p>

</xml_diff>